<commit_message>
Replace 'Answer Template' header with assignment titles; update academic year
Co-Authored-By: Claude Opus 5.5 <noreply@anthropic.com>
Claude-Session: https://claude.ai/code/session_01CuowyRKknHJcUbt9phQMxj
</commit_message>
<xml_diff>
--- a/HMGT 311 Assignment 1 Bassam K.docx
+++ b/HMGT 311 Assignment 1 Bassam K.docx
@@ -1242,7 +1242,7 @@
               <w:bCs/>
               <w:color w:val="FFFFFF" w:themeColor="background1"/>
             </w:rPr>
-            <w:t>Assignment</w:t>
+            <w:t>Assignment 1: Luxury Hospitality &amp; Brand Management</w:t>
           </w:r>
           <w:r>
             <w:rPr>
@@ -1250,7 +1250,7 @@
               <w:bCs/>
               <w:color w:val="FFFFFF" w:themeColor="background1"/>
             </w:rPr>
-            <w:t xml:space="preserve"> Answer Template</w:t>
+            <w:t xml:space="preserve"/>
           </w:r>
         </w:p>
       </w:tc>
@@ -1286,7 +1286,7 @@
               <w:bCs/>
               <w:lang w:val="en-GB"/>
             </w:rPr>
-            <w:t>Academic Year 1447 H (2025-2026 G), Fall 2025</w:t>
+            <w:t>Academic Year 1448 H (2026-2027 G), Fall 2026</w:t>
           </w:r>
         </w:p>
       </w:tc>
@@ -1518,7 +1518,7 @@
               <w:bCs/>
               <w:color w:val="FFFFFF" w:themeColor="background1"/>
             </w:rPr>
-            <w:t xml:space="preserve">Assignment </w:t>
+            <w:t xml:space="preserve">Assignment 1: Luxury Hospitality &amp; Brand Management</w:t>
           </w:r>
           <w:r>
             <w:rPr>
@@ -1526,7 +1526,7 @@
               <w:bCs/>
               <w:color w:val="FFFFFF" w:themeColor="background1"/>
             </w:rPr>
-            <w:t xml:space="preserve">Answer </w:t>
+            <w:t xml:space="preserve"/>
           </w:r>
           <w:r>
             <w:rPr>
@@ -1534,7 +1534,7 @@
               <w:bCs/>
               <w:color w:val="FFFFFF" w:themeColor="background1"/>
             </w:rPr>
-            <w:t>file</w:t>
+            <w:t/>
           </w:r>
         </w:p>
       </w:tc>
@@ -1570,7 +1570,7 @@
               <w:bCs/>
               <w:lang w:val="en-GB"/>
             </w:rPr>
-            <w:t>Academic Year 1447 H (2025-2026 G), Fall 2025</w:t>
+            <w:t>Academic Year 1448 H (2026-2027 G), Fall 2026</w:t>
           </w:r>
         </w:p>
       </w:tc>

</xml_diff>

<commit_message>
Replace header logo with new UPM logo
Co-Authored-By: Claude Opus 5.5 <noreply@anthropic.com>
Claude-Session: https://claude.ai/code/session_01CuowyRKknHJcUbt9phQMxj
</commit_message>
<xml_diff>
--- a/HMGT 311 Assignment 1 Bassam K.docx
+++ b/HMGT 311 Assignment 1 Bassam K.docx
@@ -1153,7 +1153,7 @@
                 <wp:positionV relativeFrom="paragraph">
                   <wp:posOffset>-42545</wp:posOffset>
                 </wp:positionV>
-                <wp:extent cx="1047750" cy="894715"/>
+                <wp:extent cx="686700" cy="894715"/>
                 <wp:effectExtent l="0" t="0" r="0" b="635"/>
                 <wp:wrapSquare wrapText="bothSides"/>
                 <wp:docPr id="1" name="Picture 1" descr="C:\Users\f.akram\Desktop\PMULogo (1).png"/>
@@ -1185,7 +1185,7 @@
                       <pic:spPr bwMode="auto">
                         <a:xfrm>
                           <a:off x="0" y="0"/>
-                          <a:ext cx="1047750" cy="894715"/>
+                          <a:ext cx="686700" cy="894715"/>
                         </a:xfrm>
                         <a:prstGeom prst="rect">
                           <a:avLst/>
@@ -1428,7 +1428,7 @@
                 <wp:positionV relativeFrom="paragraph">
                   <wp:posOffset>-42545</wp:posOffset>
                 </wp:positionV>
-                <wp:extent cx="1047750" cy="894715"/>
+                <wp:extent cx="686700" cy="894715"/>
                 <wp:effectExtent l="0" t="0" r="0" b="635"/>
                 <wp:wrapSquare wrapText="bothSides"/>
                 <wp:docPr id="20" name="Picture 20" descr="C:\Users\f.akram\Desktop\PMULogo (1).png"/>
@@ -1460,7 +1460,7 @@
                       <pic:spPr bwMode="auto">
                         <a:xfrm>
                           <a:off x="0" y="0"/>
-                          <a:ext cx="1047750" cy="894715"/>
+                          <a:ext cx="686700" cy="894715"/>
                         </a:xfrm>
                         <a:prstGeom prst="rect">
                           <a:avLst/>

</xml_diff>